<commit_message>
Renumber the register in reading order: T-01 through T-27
Per instruction. The first editions numbered lessons in the order they were
LEARNED, and once the document was reorganised for a reader that history read
as chaos on the page — T-001, T-024, T-004, T-018 in sequence. IDs now follow
document order, strictly T-01..T-27.

Done in the source, not the rendering: every cross-reference inside the lesson
texts ("see T-021", "the QNB picture under T-003") was rewritten through the
same one-pass mapping, and the old-to-new table is recorded in the source
header for anyone holding an earlier edition. Verified on the built document:
headings appear strictly sequential, and no three-digit identifier survives
anywhere in the text.

Co-Authored-By: Claude Opus 5 <noreply@anthropic.com>
Claude-Session: https://claude.ai/code/session_014HNH9A7v9pgFYdJh8WuDMG
</commit_message>
<xml_diff>
--- a/engine/lab/ta_calibration/Technical_Lessons_Register.docx
+++ b/engine/lab/ta_calibration/Technical_Lessons_Register.docx
@@ -443,7 +443,7 @@
         <w:spacing w:after="120"/>
       </w:pPr>
       <w:r>
-        <w:t xml:space="preserve">Two habits keep the scoring honest. First, a claim about a level is never judged on its own — it races an invented level a similar distance away, placed where the chart shows nothing, because "price stopped near our line" means little if price also stops near lines that mean nothing. Second, results are quoted as "so many in 100" against the market’s own base rate, never against 50%, because stocks do not flip fair coins (see T-026).</w:t>
+        <w:t xml:space="preserve">Two habits keep the scoring honest. First, a claim about a level is never judged on its own — it races an invented level a similar distance away, placed where the chart shows nothing, because "price stopped near our line" means little if price also stops near lines that mean nothing. Second, results are quoted as "so many in 100" against the market’s own base rate, never against 50%, because stocks do not flip fair coins (see T-06).</w:t>
       </w:r>
     </w:p>
     <w:p>
@@ -1906,7 +1906,7 @@
         <w:spacing w:after="120"/>
       </w:pPr>
       <w:r>
-        <w:t xml:space="preserve">The settings are conventional ones, chosen before any of this was measured. They are NOT fitted to the data, which is why the calibration can test them honestly — but it also means several of them are simply inherited, and three lessons below (T-014, T-015, T-017) find that the read’s own ranking and weighting of levels do not match what the levels actually do.</w:t>
+        <w:t xml:space="preserve">The settings are conventional ones, chosen before any of this was measured. They are NOT fitted to the data, which is why the calibration can test them honestly — but it also means several of them are simply inherited, and three lessons below (T-16, T-18, T-19) find that the read’s own ranking and weighting of levels do not match what the levels actually do.</w:t>
       </w:r>
     </w:p>
     <w:p>
@@ -1937,7 +1937,7 @@
           <w:sz w:val="24"/>
           <w:szCs w:val="24"/>
         </w:rPr>
-        <w:t xml:space="preserve">T-001  Judge a tool over the time it is meant for.</w:t>
+        <w:t xml:space="preserve">T-01  Judge a tool over the time it is meant for.</w:t>
       </w:r>
     </w:p>
     <w:p>
@@ -2079,7 +2079,7 @@
           <w:sz w:val="24"/>
           <w:szCs w:val="24"/>
         </w:rPr>
-        <w:t xml:space="preserve">T-002  The single most trustworthy sentence on a page is the one about the tape.</w:t>
+        <w:t xml:space="preserve">T-02  The single most trustworthy sentence on a page is the one about the tape.</w:t>
       </w:r>
     </w:p>
     <w:p>
@@ -2221,7 +2221,7 @@
           <w:sz w:val="24"/>
           <w:szCs w:val="24"/>
         </w:rPr>
-        <w:t xml:space="preserve">T-003  The lines are real. Price respects a drawn level more than an empty one.</w:t>
+        <w:t xml:space="preserve">T-03  The lines are real. Price respects a drawn level more than an empty one.</w:t>
       </w:r>
     </w:p>
     <w:p>
@@ -2363,7 +2363,7 @@
           <w:sz w:val="24"/>
           <w:szCs w:val="24"/>
         </w:rPr>
-        <w:t xml:space="preserve">T-024  The floor is stronger than the ceiling.</w:t>
+        <w:t xml:space="preserve">T-04  The floor is stronger than the ceiling.</w:t>
       </w:r>
     </w:p>
     <w:p>
@@ -2410,7 +2410,7 @@
           <w:sz w:val="21"/>
           <w:szCs w:val="21"/>
         </w:rPr>
-        <w:t xml:space="preserve">Same race as T-003, split by side. Over one week, support beats its invented twin by +11.4 in 100 tests (1,442 paired tests) against +8.8 in 100 for resistance (2,548); over one month, +6.0 in 100 against +4.5 in 100.</w:t>
+        <w:t xml:space="preserve">Same race as T-03, split by side. Over one week, support beats its invented twin by +11.4 in 100 tests (1,442 paired tests) against +8.8 in 100 for resistance (2,548); over one month, +6.0 in 100 against +4.5 in 100.</w:t>
       </w:r>
     </w:p>
     <w:p>
@@ -2505,7 +2505,7 @@
           <w:sz w:val="24"/>
           <w:szCs w:val="24"/>
         </w:rPr>
-        <w:t xml:space="preserve">T-025  Most weeks, the levels are scenery. The test only starts when price arrives.</w:t>
+        <w:t xml:space="preserve">T-05  Most weeks, the levels are scenery. The test only starts when price arrives.</w:t>
       </w:r>
     </w:p>
     <w:p>
@@ -2647,7 +2647,7 @@
           <w:sz w:val="24"/>
           <w:szCs w:val="24"/>
         </w:rPr>
-        <w:t xml:space="preserve">T-026  The coin is not fair — and its tilt depends on the market and the clock.</w:t>
+        <w:t xml:space="preserve">T-06  The coin is not fair — and its tilt depends on the market and the clock.</w:t>
       </w:r>
     </w:p>
     <w:p>
@@ -2789,7 +2789,7 @@
           <w:sz w:val="24"/>
           <w:szCs w:val="24"/>
         </w:rPr>
-        <w:t xml:space="preserve">T-004  Being above all three averages is worth about three extra wins in a hundred.</w:t>
+        <w:t xml:space="preserve">T-07  Being above all three averages is worth about three extra wins in a hundred.</w:t>
       </w:r>
     </w:p>
     <w:p>
@@ -2836,7 +2836,7 @@
           <w:sz w:val="21"/>
           <w:szCs w:val="21"/>
         </w:rPr>
-        <w:t xml:space="preserve">The test: compare weeks that began above the whole stack with weeks that began below it, 26,943 readings in all. Above-the-stack weeks closed higher +3.2 in 100 more often. Egypt, the UAE and Saudi give statistically the same answer (+3.4 in 100, +3.3 in 100, +3.6 in 100), so it is one rule, not three. But see T-021: its recent record is in question.</w:t>
+        <w:t xml:space="preserve">The test: compare weeks that began above the whole stack with weeks that began below it, 26,943 readings in all. Above-the-stack weeks closed higher +3.2 in 100 more often. Egypt, the UAE and Saudi give statistically the same answer (+3.4 in 100, +3.3 in 100, +3.6 in 100), so it is one rule, not three. But see T-20: its recent record is in question.</w:t>
       </w:r>
     </w:p>
     <w:p>
@@ -2857,7 +2857,7 @@
           <w:sz w:val="21"/>
           <w:szCs w:val="21"/>
         </w:rPr>
-        <w:t xml:space="preserve">See T-021 — the second half of the data has already put this on watch at the one-month horizon.</w:t>
+        <w:t xml:space="preserve">See T-20 — the second half of the data has already put this on watch at the one-month horizon.</w:t>
       </w:r>
     </w:p>
     <w:p>
@@ -2871,7 +2871,7 @@
           <w:sz w:val="24"/>
           <w:szCs w:val="24"/>
         </w:rPr>
-        <w:t xml:space="preserve">T-018  The slope of the 200-day average beats the position against it.</w:t>
+        <w:t xml:space="preserve">T-08  The slope of the 200-day average beats the position against it.</w:t>
       </w:r>
     </w:p>
     <w:p>
@@ -3013,7 +3013,7 @@
           <w:sz w:val="24"/>
           <w:szCs w:val="24"/>
         </w:rPr>
-        <w:t xml:space="preserve">T-019  Stocks near their yearly high keep winning. "Cheap because it fell" loses.</w:t>
+        <w:t xml:space="preserve">T-09  Stocks near their yearly high keep winning. "Cheap because it fell" loses.</w:t>
       </w:r>
     </w:p>
     <w:p>
@@ -3155,7 +3155,7 @@
           <w:sz w:val="24"/>
           <w:szCs w:val="24"/>
         </w:rPr>
-        <w:t xml:space="preserve">T-020  RSI is silent across nine tenths of its range.</w:t>
+        <w:t xml:space="preserve">T-10  RSI is silent across nine tenths of its range.</w:t>
       </w:r>
     </w:p>
     <w:p>
@@ -3297,7 +3297,7 @@
           <w:sz w:val="24"/>
           <w:szCs w:val="24"/>
         </w:rPr>
-        <w:t xml:space="preserve">T-006  A word that sounds like caution still needs checking. Ours pointed backwards.</w:t>
+        <w:t xml:space="preserve">T-11  A word that sounds like caution still needs checking. Ours pointed backwards.</w:t>
       </w:r>
     </w:p>
     <w:p>
@@ -3379,7 +3379,7 @@
           <w:sz w:val="24"/>
           <w:szCs w:val="24"/>
         </w:rPr>
-        <w:t xml:space="preserve">T-005  The MACD paragraph is the least useful ink on the page.</w:t>
+        <w:t xml:space="preserve">T-12  The MACD paragraph is the least useful ink on the page.</w:t>
       </w:r>
     </w:p>
     <w:p>
@@ -3461,7 +3461,7 @@
           <w:sz w:val="24"/>
           <w:szCs w:val="24"/>
         </w:rPr>
-        <w:t xml:space="preserve">T-011  "A close above resistance opens the next zone" — our data says the opposite.</w:t>
+        <w:t xml:space="preserve">T-13  "A close above resistance opens the next zone" — our data says the opposite.</w:t>
       </w:r>
     </w:p>
     <w:p>
@@ -3487,7 +3487,7 @@
           <w:sz w:val="21"/>
           <w:szCs w:val="21"/>
         </w:rPr>
-        <w:t xml:space="preserve">The old pages carried one genuinely conditional promise: close above the nearest resistance, and the far zone opens. It is the most natural sentence in technical analysis and it fails in the most instructive way possible — clearing a REAL level makes the next target LESS likely to be reached than clearing an empty price does. Why? Because the far level is real too. If lines hold (T-003), they also hold when they are your target. The sentence was rewritten on 31-Aug-2026 to name the next level without promising it.</w:t>
+        <w:t xml:space="preserve">The old pages carried one genuinely conditional promise: close above the nearest resistance, and the far zone opens. It is the most natural sentence in technical analysis and it fails in the most instructive way possible — clearing a REAL level makes the next target LESS likely to be reached than clearing an empty price does. Why? Because the far level is real too. If lines hold (T-03), they also hold when they are your target. The sentence was rewritten on 31-Aug-2026 to name the next level without promising it.</w:t>
       </w:r>
     </w:p>
     <w:p>
@@ -3663,7 +3663,7 @@
           <w:sz w:val="24"/>
           <w:szCs w:val="24"/>
         </w:rPr>
-        <w:t xml:space="preserve">T-012  A golden cross is a description of the past, not a promise about the future.</w:t>
+        <w:t xml:space="preserve">T-14  A golden cross is a description of the past, not a promise about the future.</w:t>
       </w:r>
     </w:p>
     <w:p>
@@ -3865,7 +3865,7 @@
           <w:sz w:val="24"/>
           <w:szCs w:val="24"/>
         </w:rPr>
-        <w:t xml:space="preserve">T-013  Volume shouts about movement and says nothing about direction.</w:t>
+        <w:t xml:space="preserve">T-15  Volume shouts about movement and says nothing about direction.</w:t>
       </w:r>
     </w:p>
     <w:p>
@@ -4007,7 +4007,7 @@
           <w:sz w:val="24"/>
           <w:szCs w:val="24"/>
         </w:rPr>
-        <w:t xml:space="preserve">T-014  For a few days, the 20-day average is as strong a line as any on the chart.</w:t>
+        <w:t xml:space="preserve">T-16  For a few days, the 20-day average is as strong a line as any on the chart.</w:t>
       </w:r>
     </w:p>
     <w:p>
@@ -4075,7 +4075,7 @@
           <w:sz w:val="21"/>
           <w:szCs w:val="21"/>
         </w:rPr>
-        <w:t xml:space="preserve">The 20-day sample is small because the read only admits an average when structure leaves a slot open. More data pulling it back to the pack would fold this into T-003.</w:t>
+        <w:t xml:space="preserve">The 20-day sample is small because the read only admits an average when structure leaves a slot open. More data pulling it back to the pack would fold this into T-03.</w:t>
       </w:r>
     </w:p>
     <w:p>
@@ -4149,7 +4149,7 @@
           <w:sz w:val="24"/>
           <w:szCs w:val="24"/>
         </w:rPr>
-        <w:t xml:space="preserve">T-016  Round numbers deserve more respect than we gave them.</w:t>
+        <w:t xml:space="preserve">T-17  Round numbers deserve more respect than we gave them.</w:t>
       </w:r>
     </w:p>
     <w:p>
@@ -4175,7 +4175,7 @@
           <w:sz w:val="21"/>
           <w:szCs w:val="21"/>
         </w:rPr>
-        <w:t xml:space="preserve">A price like 20.00 or 150 is where human orders cluster, and our read treats such lines as a last resort. Measured, a round number holds about three quarters as well as genuine charted structure — clearly weaker, clearly not nothing. The QNB picture under T-003 is, fittingly, a round number doing the work.</w:t>
+        <w:t xml:space="preserve">A price like 20.00 or 150 is where human orders cluster, and our read treats such lines as a last resort. Measured, a round number holds about three quarters as well as genuine charted structure — clearly weaker, clearly not nothing. The QNB picture under T-03 is, fittingly, a round number doing the work.</w:t>
       </w:r>
     </w:p>
     <w:p>
@@ -4231,7 +4231,7 @@
           <w:sz w:val="24"/>
           <w:szCs w:val="24"/>
         </w:rPr>
-        <w:t xml:space="preserve">T-015  A level tested five times is no stronger than a level tested once.</w:t>
+        <w:t xml:space="preserve">T-18  A level tested five times is no stronger than a level tested once.</w:t>
       </w:r>
     </w:p>
     <w:p>
@@ -4373,7 +4373,7 @@
           <w:sz w:val="24"/>
           <w:szCs w:val="24"/>
         </w:rPr>
-        <w:t xml:space="preserve">T-017  The level printed first is not the one to trust most.</w:t>
+        <w:t xml:space="preserve">T-19  The level printed first is not the one to trust most.</w:t>
       </w:r>
     </w:p>
     <w:p>
@@ -4455,7 +4455,7 @@
           <w:sz w:val="24"/>
           <w:szCs w:val="24"/>
         </w:rPr>
-        <w:t xml:space="preserve">T-021  The moving-average-stack effect worked before 2020 and has not worked since.</w:t>
+        <w:t xml:space="preserve">T-20  The moving-average-stack effect worked before 2020 and has not worked since.</w:t>
       </w:r>
     </w:p>
     <w:p>
@@ -4597,7 +4597,7 @@
           <w:sz w:val="24"/>
           <w:szCs w:val="24"/>
         </w:rPr>
-        <w:t xml:space="preserve">T-022  The level edge and the tape reading pass the same durability test.</w:t>
+        <w:t xml:space="preserve">T-21  The level edge and the tape reading pass the same durability test.</w:t>
       </w:r>
     </w:p>
     <w:p>
@@ -4665,7 +4665,7 @@
           <w:sz w:val="21"/>
           <w:szCs w:val="21"/>
         </w:rPr>
-        <w:t xml:space="preserve">Either measure fading toward zero in a future half — the same check that caught T-021 is standing guard here.</w:t>
+        <w:t xml:space="preserve">Either measure fading toward zero in a future half — the same check that caught T-20 is standing guard here.</w:t>
       </w:r>
     </w:p>
     <w:p>
@@ -4679,7 +4679,7 @@
           <w:sz w:val="24"/>
           <w:szCs w:val="24"/>
         </w:rPr>
-        <w:t xml:space="preserve">T-023  Four small words that keep four different promises.</w:t>
+        <w:t xml:space="preserve">T-22  Four small words that keep four different promises.</w:t>
       </w:r>
     </w:p>
     <w:p>
@@ -4847,7 +4847,7 @@
           <w:sz w:val="24"/>
           <w:szCs w:val="24"/>
         </w:rPr>
-        <w:t xml:space="preserve">T-007  Where the chart is drawn changes what a level is worth. Saudi doubles Egypt.</w:t>
+        <w:t xml:space="preserve">T-23  Where the chart is drawn changes what a level is worth. Saudi doubles Egypt.</w:t>
       </w:r>
     </w:p>
     <w:p>
@@ -4989,7 +4989,7 @@
           <w:sz w:val="24"/>
           <w:szCs w:val="24"/>
         </w:rPr>
-        <w:t xml:space="preserve">T-008  The tape reading works everywhere; it works hardest in the Gulf.</w:t>
+        <w:t xml:space="preserve">T-24  The tape reading works everywhere; it works hardest in the Gulf.</w:t>
       </w:r>
     </w:p>
     <w:p>
@@ -5080,7 +5080,7 @@
           <w:sz w:val="24"/>
           <w:szCs w:val="24"/>
         </w:rPr>
-        <w:t xml:space="preserve">T-009  For charts, the exchange is a real category. The industry mostly is not.</w:t>
+        <w:t xml:space="preserve">T-25  For charts, the exchange is a real category. The industry mostly is not.</w:t>
       </w:r>
     </w:p>
     <w:p>
@@ -5179,7 +5179,7 @@
           <w:sz w:val="24"/>
           <w:szCs w:val="24"/>
         </w:rPr>
-        <w:t xml:space="preserve">T-010  Only the tape sentence has earned the right to be said stock-by-stock.</w:t>
+        <w:t xml:space="preserve">T-26  Only the tape sentence has earned the right to be said stock-by-stock.</w:t>
       </w:r>
     </w:p>
     <w:p>
@@ -5321,7 +5321,7 @@
           <w:sz w:val="24"/>
           <w:szCs w:val="24"/>
         </w:rPr>
-        <w:t xml:space="preserve">T-027  IHC is the most readable chart in the book. SALIK and LULU cannot be read at all yet.</w:t>
+        <w:t xml:space="preserve">T-27  IHC is the most readable chart in the book. SALIK and LULU cannot be read at all yet.</w:t>
       </w:r>
     </w:p>
     <w:p>
@@ -5368,7 +5368,7 @@
           <w:sz w:val="21"/>
           <w:szCs w:val="21"/>
         </w:rPr>
-        <w:t xml:space="preserve">IHC: tape correlation +0.82 over 468 monthly readings — the highest in the book (see the chart under T-002). SALIK has 88 weekly readings of history and LULU 0, against the roughly 60 this calibration requires before it will print a stock-specific number.</w:t>
+        <w:t xml:space="preserve">IHC: tape correlation +0.82 over 468 monthly readings — the highest in the book (see the chart under T-02). SALIK has 88 weekly readings of history and LULU 0, against the roughly 60 this calibration requires before it will print a stock-specific number.</w:t>
       </w:r>
     </w:p>
     <w:p>

</xml_diff>